<commit_message>
fix(deliverables): 兼容 Windows 文本换行
</commit_message>
<xml_diff>
--- a/deliverables/windows-deployment-operations.docx
+++ b/deliverables/windows-deployment-operations.docx
@@ -324,6 +324,16 @@
           <w:b w:val="0"/>
           <w:i w:val="0"/>
         </w:rPr>
+        <w:t>必须使用普通用户权限运行原生包。若 PowerShell 或承载终端的 VS Code 以管理员身份运行，包内 PostgreSQL 会拒绝启动；请完整关闭管理员窗口，再重新打开普通用户 PowerShell。</w:t>
+      </w:r>
+    </w:p>
+    <w:p>
+      <w:r>
+        <w:rPr>
+          <w:rFonts w:ascii="Arial" w:hAnsi="Arial" w:eastAsia="Microsoft YaHei"/>
+          <w:b w:val="0"/>
+          <w:i w:val="0"/>
+        </w:rPr>
         <w:t>不要把发布包解压到系统根目录、临时下载目录或会自动同步/清理的目录。推荐由组织确定一个长期固定目录。首次启动生成实例身份后，不要移动整个解压目录；路径和实例身份不一致时，启停、备份和清理会拒绝执行。</w:t>
       </w:r>
     </w:p>
@@ -505,6 +515,254 @@
           <w:i w:val="0"/>
         </w:rPr>
         <w:t>，请关闭后按上述步骤重新打开 PowerShell。不要把示例路径原样执行：先在文件资源管理器中找到实际 ZIP，按住 Shift 右键该文件选择“复制文件地址”，再替换代码框中的路径。文件资源管理器顶部的地址栏可用于确认安装目录。</w:t>
+      </w:r>
+    </w:p>
+    <w:p>
+      <w:pPr>
+        <w:pStyle w:val="Heading3"/>
+      </w:pPr>
+      <w:r>
+        <w:rPr>
+          <w:rFonts w:ascii="Arial" w:hAnsi="Arial" w:eastAsia="Microsoft YaHei"/>
+          <w:b w:val="0"/>
+          <w:i w:val="0"/>
+        </w:rPr>
+        <w:t>2.2 判断实际运行权限与 UAC</w:t>
+      </w:r>
+    </w:p>
+    <w:p>
+      <w:r>
+        <w:rPr>
+          <w:rFonts w:ascii="Arial" w:hAnsi="Arial" w:eastAsia="Microsoft YaHei"/>
+          <w:b w:val="0"/>
+          <w:i w:val="0"/>
+        </w:rPr>
+        <w:t>没有选择“以管理员身份运行”并不能单独证明 PowerShell 使用普通权限。PowerShell 会继承父进程权限：若 VS Code、Windows Terminal 或其他承载程序已经提升，内部终端仍是管理员权限。若当前账号属于本机 Administrators 组且 Windows UAC 被完全关闭，直接从开始菜单打开的 PowerShell 也会取得完整管理员令牌。包内 PostgreSQL 拒绝在这种令牌下启动。</w:t>
+      </w:r>
+    </w:p>
+    <w:p>
+      <w:r>
+        <w:rPr>
+          <w:rFonts w:ascii="Arial" w:hAnsi="Arial" w:eastAsia="Microsoft YaHei"/>
+          <w:b w:val="0"/>
+          <w:i w:val="0"/>
+        </w:rPr>
+        <w:t>在准备运行发布包的同一个 PowerShell 窗口执行：</w:t>
+      </w:r>
+    </w:p>
+    <w:p>
+      <w:pPr>
+        <w:spacing w:before="80" w:after="120"/>
+        <w:ind w:left="340" w:right="227"/>
+        <w:shd w:fill="F2F2F2"/>
+      </w:pPr>
+      <w:r>
+        <w:rPr>
+          <w:rFonts w:ascii="Consolas" w:hAnsi="Consolas" w:eastAsia="Microsoft YaHei"/>
+          <w:sz w:val="18"/>
+        </w:rPr>
+        <w:t>$identity = [Security.Principal.WindowsIdentity]::GetCurrent()</w:t>
+        <w:br/>
+        <w:t>$principal = [Security.Principal.WindowsPrincipal]::new($identity)</w:t>
+        <w:br/>
+        <w:t>$isAdministrator = $principal.IsInRole([Security.Principal.WindowsBuiltInRole]::Administrator)</w:t>
+        <w:br/>
+        <w:t>$enableLua = (Get-ItemProperty -LiteralPath 'HKLM:\SOFTWARE\Microsoft\Windows\CurrentVersion\Policies\System').EnableLUA</w:t>
+        <w:br/>
+        <w:t>[pscustomobject]@{ IsAdministrator = $isAdministrator; EnableLUA = $enableLua }</w:t>
+      </w:r>
+    </w:p>
+    <w:p>
+      <w:r>
+        <w:rPr>
+          <w:rFonts w:ascii="Arial" w:hAnsi="Arial" w:eastAsia="Microsoft YaHei"/>
+          <w:b w:val="0"/>
+          <w:i w:val="0"/>
+        </w:rPr>
+        <w:t>按结果处理：</w:t>
+      </w:r>
+    </w:p>
+    <w:p>
+      <w:pPr>
+        <w:pStyle w:val="ListBullet"/>
+      </w:pPr>
+      <w:r>
+        <w:rPr>
+          <w:rFonts w:ascii="Consolas" w:hAnsi="Consolas" w:eastAsia="Microsoft YaHei"/>
+          <w:b w:val="0"/>
+          <w:i w:val="0"/>
+          <w:color w:val="464646"/>
+          <w:sz w:val="19"/>
+        </w:rPr>
+        <w:t>IsAdministrator=False</w:t>
+      </w:r>
+      <w:r>
+        <w:rPr>
+          <w:rFonts w:ascii="Arial" w:hAnsi="Arial" w:eastAsia="Microsoft YaHei"/>
+          <w:b w:val="0"/>
+          <w:i w:val="0"/>
+        </w:rPr>
+        <w:t>：当前是普通权限，可以继续预检。</w:t>
+      </w:r>
+    </w:p>
+    <w:p>
+      <w:pPr>
+        <w:pStyle w:val="ListBullet"/>
+      </w:pPr>
+      <w:r>
+        <w:rPr>
+          <w:rFonts w:ascii="Consolas" w:hAnsi="Consolas" w:eastAsia="Microsoft YaHei"/>
+          <w:b w:val="0"/>
+          <w:i w:val="0"/>
+          <w:color w:val="464646"/>
+          <w:sz w:val="19"/>
+        </w:rPr>
+        <w:t>IsAdministrator=True</w:t>
+      </w:r>
+      <w:r>
+        <w:rPr>
+          <w:rFonts w:ascii="Arial" w:hAnsi="Arial" w:eastAsia="Microsoft YaHei"/>
+          <w:b w:val="0"/>
+          <w:i w:val="0"/>
+        </w:rPr>
+        <w:t xml:space="preserve"> 且 </w:t>
+      </w:r>
+      <w:r>
+        <w:rPr>
+          <w:rFonts w:ascii="Consolas" w:hAnsi="Consolas" w:eastAsia="Microsoft YaHei"/>
+          <w:b w:val="0"/>
+          <w:i w:val="0"/>
+          <w:color w:val="464646"/>
+          <w:sz w:val="19"/>
+        </w:rPr>
+        <w:t>EnableLUA=1</w:t>
+      </w:r>
+      <w:r>
+        <w:rPr>
+          <w:rFonts w:ascii="Arial" w:hAnsi="Arial" w:eastAsia="Microsoft YaHei"/>
+          <w:b w:val="0"/>
+          <w:i w:val="0"/>
+        </w:rPr>
+        <w:t>：关闭当前 PowerShell；若由 VS Code 或 Windows Terminal 承载，还要完整关闭其全部窗口，再从开始菜单以普通方式重新打开并复查。</w:t>
+      </w:r>
+    </w:p>
+    <w:p>
+      <w:pPr>
+        <w:pStyle w:val="ListBullet"/>
+      </w:pPr>
+      <w:r>
+        <w:rPr>
+          <w:rFonts w:ascii="Consolas" w:hAnsi="Consolas" w:eastAsia="Microsoft YaHei"/>
+          <w:b w:val="0"/>
+          <w:i w:val="0"/>
+          <w:color w:val="464646"/>
+          <w:sz w:val="19"/>
+        </w:rPr>
+        <w:t>IsAdministrator=True</w:t>
+      </w:r>
+      <w:r>
+        <w:rPr>
+          <w:rFonts w:ascii="Arial" w:hAnsi="Arial" w:eastAsia="Microsoft YaHei"/>
+          <w:b w:val="0"/>
+          <w:i w:val="0"/>
+        </w:rPr>
+        <w:t xml:space="preserve"> 且 </w:t>
+      </w:r>
+      <w:r>
+        <w:rPr>
+          <w:rFonts w:ascii="Consolas" w:hAnsi="Consolas" w:eastAsia="Microsoft YaHei"/>
+          <w:b w:val="0"/>
+          <w:i w:val="0"/>
+          <w:color w:val="464646"/>
+          <w:sz w:val="19"/>
+        </w:rPr>
+        <w:t>EnableLUA=0</w:t>
+      </w:r>
+      <w:r>
+        <w:rPr>
+          <w:rFonts w:ascii="Arial" w:hAnsi="Arial" w:eastAsia="Microsoft YaHei"/>
+          <w:b w:val="0"/>
+          <w:i w:val="0"/>
+        </w:rPr>
+        <w:t>：UAC 已被完全关闭。对于 Administrators 组账号，即使没有选择“以管理员身份运行”，进程仍可能取得完整管理员令牌。应由电脑管理员按组织策略重新启用 UAC 并重启 Windows，或改用不属于 Administrators 组的标准 Windows 用户运行本包。</w:t>
+      </w:r>
+    </w:p>
+    <w:p>
+      <w:r>
+        <w:rPr>
+          <w:rFonts w:ascii="Arial" w:hAnsi="Arial" w:eastAsia="Microsoft YaHei"/>
+          <w:b w:val="0"/>
+          <w:i w:val="0"/>
+        </w:rPr>
+        <w:t>经批准需要重新启用 UAC 时，电脑管理员可在管理员 PowerShell 中执行以下机器级修改，然后手工重启 Windows：</w:t>
+      </w:r>
+    </w:p>
+    <w:p>
+      <w:pPr>
+        <w:spacing w:before="80" w:after="120"/>
+        <w:ind w:left="340" w:right="227"/>
+        <w:shd w:fill="F2F2F2"/>
+      </w:pPr>
+      <w:r>
+        <w:rPr>
+          <w:rFonts w:ascii="Consolas" w:hAnsi="Consolas" w:eastAsia="Microsoft YaHei"/>
+          <w:sz w:val="18"/>
+        </w:rPr>
+        <w:t>Set-ItemProperty `</w:t>
+        <w:br/>
+        <w:t xml:space="preserve">  -LiteralPath 'HKLM:\SOFTWARE\Microsoft\Windows\CurrentVersion\Policies\System' `</w:t>
+        <w:br/>
+        <w:t xml:space="preserve">  -Name EnableLUA `</w:t>
+        <w:br/>
+        <w:t xml:space="preserve">  -Type DWord `</w:t>
+        <w:br/>
+        <w:t xml:space="preserve">  -Value 1</w:t>
+      </w:r>
+    </w:p>
+    <w:p>
+      <w:r>
+        <w:rPr>
+          <w:rFonts w:ascii="Arial" w:hAnsi="Arial" w:eastAsia="Microsoft YaHei"/>
+          <w:b w:val="0"/>
+          <w:i w:val="0"/>
+        </w:rPr>
+        <w:t xml:space="preserve">重启后必须在新的普通 PowerShell 中再次执行上述检查，确认 </w:t>
+      </w:r>
+      <w:r>
+        <w:rPr>
+          <w:rFonts w:ascii="Consolas" w:hAnsi="Consolas" w:eastAsia="Microsoft YaHei"/>
+          <w:b w:val="0"/>
+          <w:i w:val="0"/>
+          <w:color w:val="464646"/>
+          <w:sz w:val="19"/>
+        </w:rPr>
+        <w:t>IsAdministrator=False</w:t>
+      </w:r>
+      <w:r>
+        <w:rPr>
+          <w:rFonts w:ascii="Arial" w:hAnsi="Arial" w:eastAsia="Microsoft YaHei"/>
+          <w:b w:val="0"/>
+          <w:i w:val="0"/>
+        </w:rPr>
+        <w:t xml:space="preserve">，再运行本包。不要修改 </w:t>
+      </w:r>
+      <w:r>
+        <w:rPr>
+          <w:rFonts w:ascii="Consolas" w:hAnsi="Consolas" w:eastAsia="Microsoft YaHei"/>
+          <w:b w:val="0"/>
+          <w:i w:val="0"/>
+          <w:color w:val="464646"/>
+          <w:sz w:val="19"/>
+        </w:rPr>
+        <w:t>preflight.ps1</w:t>
+      </w:r>
+      <w:r>
+        <w:rPr>
+          <w:rFonts w:ascii="Arial" w:hAnsi="Arial" w:eastAsia="Microsoft YaHei"/>
+          <w:b w:val="0"/>
+          <w:i w:val="0"/>
+        </w:rPr>
+        <w:t xml:space="preserve"> 或 PostgreSQL 程序来绕过权限检查。</w:t>
       </w:r>
     </w:p>
     <w:p>

</xml_diff>